<commit_message>
chore(report): refresh phase 3b completion evidence
</commit_message>
<xml_diff>
--- a/docs/reports/phase-3b-sprite-python-engine/phase-3b-sprite-python-engine-report.docx
+++ b/docs/reports/phase-3b-sprite-python-engine/phase-3b-sprite-python-engine-report.docx
@@ -30,7 +30,7 @@
     </w:p>
     <w:p>
       <w:r>
-        <w:t>Phase 3B is complete. Strut now has a documented Rust/Tauri plus sprite-python split, a minimal deterministic Python sprite/vector authoring package, generated { plan, operations } fixtures for dice/logo/loader/mascot, and Rust tests proving those Python envelopes validate through the existing Phase 3A generation-plan and operation conversion path.</w:t>
+        <w:t>Phase 3B is closed after the completion fix pass. Strut now has a documented Rust/Tauri plus sprite-python split, a minimal deterministic Python sprite/vector authoring package, generated { plan, operations } fixtures for dice/logo/loader/mascot, committed source roadmap docs, and Rust tests proving those Python envelopes validate through the existing Phase 3A generation-plan and operation conversion path.</w:t>
       </w:r>
     </w:p>
     <w:p>
@@ -90,6 +90,48 @@
         <w:pStyle w:val="Heading2"/>
       </w:pPr>
       <w:r>
+        <w:t>Completion Fix Pass Dirty Files</w:t>
+      </w:r>
+    </w:p>
+    <w:p>
+      <w:r>
+        <w:t>Captured with git status --short --branch at the start of the completion fix pass:</w:t>
+      </w:r>
+    </w:p>
+    <w:p>
+      <w:r>
+        <w:rPr>
+          <w:rFonts w:ascii="Consolas" w:hAnsi="Consolas"/>
+        </w:rPr>
+        <w:t>## codex/phase-1-ai-editor-shell</w:t>
+        <w:br/>
+        <w:t xml:space="preserve"> M README.md</w:t>
+        <w:br/>
+        <w:t xml:space="preserve"> M docs/README.md</w:t>
+        <w:br/>
+        <w:t xml:space="preserve"> M docs/guides/generate-a-character.md</w:t>
+        <w:br/>
+        <w:t xml:space="preserve"> M docs/learn/first-animation.md</w:t>
+        <w:br/>
+        <w:t xml:space="preserve"> M docs/learn/quick-start.md</w:t>
+        <w:br/>
+        <w:t xml:space="preserve"> M docs/learn/what-is-strut.md</w:t>
+        <w:br/>
+        <w:t>?? docs/learn/motion-language.md</w:t>
+        <w:br/>
+        <w:t>?? docs/superpowers/</w:t>
+      </w:r>
+    </w:p>
+    <w:p>
+      <w:r>
+        <w:t>The fix pass committed only the Phase 3B plan docs from docs/superpowers/ and left the unrelated dirty learn/readme files untouched.</w:t>
+      </w:r>
+    </w:p>
+    <w:p>
+      <w:pPr>
+        <w:pStyle w:val="Heading2"/>
+      </w:pPr>
+      <w:r>
         <w:t>Scope Completed</w:t>
       </w:r>
     </w:p>
@@ -98,7 +140,7 @@
         <w:pStyle w:val="ListBullet"/>
       </w:pPr>
       <w:r>
-        <w:t>Added `docs/internal/sprite-python-architecture.md` to lock the architecture boundary.</w:t>
+        <w:t>Added docs/internal/sprite-python-architecture.md to lock the architecture boundary.</w:t>
       </w:r>
     </w:p>
     <w:p>
@@ -106,7 +148,7 @@
         <w:pStyle w:val="ListBullet"/>
       </w:pPr>
       <w:r>
-        <w:t>Added `packages/strut-python/` with sprite/vector primitives:</w:t>
+        <w:t>Added packages/strut-python/ with sprite/vector primitives:</w:t>
       </w:r>
     </w:p>
     <w:p>
@@ -186,7 +228,7 @@
         <w:pStyle w:val="ListBullet"/>
       </w:pPr>
       <w:r>
-        <w:t>Added Rust-side validation tests that read Python-generated fixtures and convert them through `document_from_generation_plan_text`.</w:t>
+        <w:t>Added Rust-side validation tests that read Python-generated fixtures and convert them through document_from_generation_plan_text.</w:t>
       </w:r>
     </w:p>
     <w:p>
@@ -195,6 +237,30 @@
       </w:pPr>
       <w:r>
         <w:t>Updated the existing UI smoke fixture labels for Phase 3B sprite-python coverage without redesigning the UI.</w:t>
+      </w:r>
+    </w:p>
+    <w:p>
+      <w:pPr>
+        <w:pStyle w:val="ListBullet"/>
+      </w:pPr>
+      <w:r>
+        <w:t>Committed the roadmap and Phase 3B source plan docs so a clean checkout contains the plan source used for this phase.</w:t>
+      </w:r>
+    </w:p>
+    <w:p>
+      <w:pPr>
+        <w:pStyle w:val="ListBullet"/>
+      </w:pPr>
+      <w:r>
+        <w:t>Applied cargo fmt --all to the Phase 3B Rust fixture test formatting.</w:t>
+      </w:r>
+    </w:p>
+    <w:p>
+      <w:pPr>
+        <w:pStyle w:val="ListBullet"/>
+      </w:pPr>
+      <w:r>
+        <w:t>Clarified the reproducible Python module command as a PowerShell command run from packages/strut-python with PYTHONPATH=src.</w:t>
       </w:r>
     </w:p>
     <w:p>
@@ -355,7 +421,23 @@
         <w:pStyle w:val="ListBullet"/>
       </w:pPr>
       <w:r>
-        <w:t>`docs/internal/sprite-python-architecture.md`</w:t>
+        <w:t>docs/internal/sprite-python-architecture.md</w:t>
+      </w:r>
+    </w:p>
+    <w:p>
+      <w:pPr>
+        <w:pStyle w:val="ListBullet"/>
+      </w:pPr>
+      <w:r>
+        <w:t>docs/superpowers/plans/2026-06-05-strut-ai-editor-revamp.md</w:t>
+      </w:r>
+    </w:p>
+    <w:p>
+      <w:pPr>
+        <w:pStyle w:val="ListBullet"/>
+      </w:pPr>
+      <w:r>
+        <w:t>docs/superpowers/plans/2026-06-08-strut-sprite-python-replan.md</w:t>
       </w:r>
     </w:p>
     <w:p>
@@ -368,7 +450,7 @@
         <w:pStyle w:val="ListBullet"/>
       </w:pPr>
       <w:r>
-        <w:t>`.gitignore`</w:t>
+        <w:t>.gitignore</w:t>
       </w:r>
     </w:p>
     <w:p>
@@ -376,7 +458,7 @@
         <w:pStyle w:val="ListBullet"/>
       </w:pPr>
       <w:r>
-        <w:t>`packages/strut-python/pyproject.toml`</w:t>
+        <w:t>packages/strut-python/pyproject.toml</w:t>
       </w:r>
     </w:p>
     <w:p>
@@ -384,7 +466,7 @@
         <w:pStyle w:val="ListBullet"/>
       </w:pPr>
       <w:r>
-        <w:t>`packages/strut-python/src/strut_python/__init__.py`</w:t>
+        <w:t>packages/strut-python/src/strut_python/__init__.py</w:t>
       </w:r>
     </w:p>
     <w:p>
@@ -392,7 +474,7 @@
         <w:pStyle w:val="ListBullet"/>
       </w:pPr>
       <w:r>
-        <w:t>`packages/strut-python/src/strut_python/model.py`</w:t>
+        <w:t>packages/strut-python/src/strut_python/model.py</w:t>
       </w:r>
     </w:p>
     <w:p>
@@ -400,7 +482,7 @@
         <w:pStyle w:val="ListBullet"/>
       </w:pPr>
       <w:r>
-        <w:t>`packages/strut-python/src/strut_python/motion.py`</w:t>
+        <w:t>packages/strut-python/src/strut_python/motion.py</w:t>
       </w:r>
     </w:p>
     <w:p>
@@ -408,7 +490,7 @@
         <w:pStyle w:val="ListBullet"/>
       </w:pPr>
       <w:r>
-        <w:t>`packages/strut-python/src/strut_python/builders.py`</w:t>
+        <w:t>packages/strut-python/src/strut_python/builders.py</w:t>
       </w:r>
     </w:p>
     <w:p>
@@ -416,7 +498,7 @@
         <w:pStyle w:val="ListBullet"/>
       </w:pPr>
       <w:r>
-        <w:t>`packages/strut-python/src/strut_python/cli.py`</w:t>
+        <w:t>packages/strut-python/src/strut_python/cli.py</w:t>
       </w:r>
     </w:p>
     <w:p>
@@ -424,7 +506,7 @@
         <w:pStyle w:val="ListBullet"/>
       </w:pPr>
       <w:r>
-        <w:t>`packages/strut-python/examples/dice.py`</w:t>
+        <w:t>packages/strut-python/examples/dice.py</w:t>
       </w:r>
     </w:p>
     <w:p>
@@ -432,7 +514,7 @@
         <w:pStyle w:val="ListBullet"/>
       </w:pPr>
       <w:r>
-        <w:t>`packages/strut-python/examples/logo.py`</w:t>
+        <w:t>packages/strut-python/examples/logo.py</w:t>
       </w:r>
     </w:p>
     <w:p>
@@ -440,7 +522,7 @@
         <w:pStyle w:val="ListBullet"/>
       </w:pPr>
       <w:r>
-        <w:t>`packages/strut-python/examples/loader.py`</w:t>
+        <w:t>packages/strut-python/examples/loader.py</w:t>
       </w:r>
     </w:p>
     <w:p>
@@ -448,7 +530,7 @@
         <w:pStyle w:val="ListBullet"/>
       </w:pPr>
       <w:r>
-        <w:t>`packages/strut-python/examples/mascot.py`</w:t>
+        <w:t>packages/strut-python/examples/mascot.py</w:t>
       </w:r>
     </w:p>
     <w:p>
@@ -456,7 +538,7 @@
         <w:pStyle w:val="ListBullet"/>
       </w:pPr>
       <w:r>
-        <w:t>`packages/strut-python/fixtures/dice.plan.json`</w:t>
+        <w:t>packages/strut-python/fixtures/dice.plan.json</w:t>
       </w:r>
     </w:p>
     <w:p>
@@ -464,7 +546,7 @@
         <w:pStyle w:val="ListBullet"/>
       </w:pPr>
       <w:r>
-        <w:t>`packages/strut-python/fixtures/logo.plan.json`</w:t>
+        <w:t>packages/strut-python/fixtures/logo.plan.json</w:t>
       </w:r>
     </w:p>
     <w:p>
@@ -472,7 +554,7 @@
         <w:pStyle w:val="ListBullet"/>
       </w:pPr>
       <w:r>
-        <w:t>`packages/strut-python/fixtures/loader.plan.json`</w:t>
+        <w:t>packages/strut-python/fixtures/loader.plan.json</w:t>
       </w:r>
     </w:p>
     <w:p>
@@ -480,7 +562,7 @@
         <w:pStyle w:val="ListBullet"/>
       </w:pPr>
       <w:r>
-        <w:t>`packages/strut-python/fixtures/mascot.plan.json`</w:t>
+        <w:t>packages/strut-python/fixtures/mascot.plan.json</w:t>
       </w:r>
     </w:p>
     <w:p>
@@ -493,7 +575,7 @@
         <w:pStyle w:val="ListBullet"/>
       </w:pPr>
       <w:r>
-        <w:t>`apps/studio/src-tauri/src/lib.rs`</w:t>
+        <w:t>apps/studio/src-tauri/src/lib.rs</w:t>
       </w:r>
     </w:p>
     <w:p>
@@ -501,7 +583,7 @@
         <w:pStyle w:val="ListBullet"/>
       </w:pPr>
       <w:r>
-        <w:t>`packages/strut-python/tests/test_examples.py`</w:t>
+        <w:t>packages/strut-python/tests/test_examples.py</w:t>
       </w:r>
     </w:p>
     <w:p>
@@ -509,7 +591,7 @@
         <w:pStyle w:val="ListBullet"/>
       </w:pPr>
       <w:r>
-        <w:t>`tests/ui/studio_bot_smoke.py`</w:t>
+        <w:t>tests/ui/studio_bot_smoke.py</w:t>
       </w:r>
     </w:p>
     <w:p>
@@ -522,7 +604,7 @@
         <w:pStyle w:val="ListBullet"/>
       </w:pPr>
       <w:r>
-        <w:t>`docs/reports/phase-3b-sprite-python-engine/phase-3b-sprite-python-engine-report.md`</w:t>
+        <w:t>docs/reports/phase-3b-sprite-python-engine/phase-3b-sprite-python-engine-report.md</w:t>
       </w:r>
     </w:p>
     <w:p>
@@ -530,7 +612,7 @@
         <w:pStyle w:val="ListBullet"/>
       </w:pPr>
       <w:r>
-        <w:t>`docs/reports/phase-3b-sprite-python-engine/phase-3b-sprite-python-engine-report.docx`</w:t>
+        <w:t>docs/reports/phase-3b-sprite-python-engine/phase-3b-sprite-python-engine-report.docx</w:t>
       </w:r>
     </w:p>
     <w:p>
@@ -538,7 +620,7 @@
         <w:pStyle w:val="ListBullet"/>
       </w:pPr>
       <w:r>
-        <w:t>`docs/reports/phase-3b-sprite-python-engine/screenshots/`</w:t>
+        <w:t>docs/reports/phase-3b-sprite-python-engine/screenshots/</w:t>
       </w:r>
     </w:p>
     <w:p>
@@ -546,7 +628,7 @@
         <w:pStyle w:val="ListBullet"/>
       </w:pPr>
       <w:r>
-        <w:t>`docs/reports/phase-3b-sprite-python-engine/rendered/README.md`</w:t>
+        <w:t>docs/reports/phase-3b-sprite-python-engine/rendered/README.md</w:t>
       </w:r>
     </w:p>
     <w:p>
@@ -562,7 +644,7 @@
         <w:pStyle w:val="ListBullet"/>
       </w:pPr>
       <w:r>
-        <w:t>`f00297f docs(arch): define sprite python engine boundary`</w:t>
+        <w:t>f00297f docs(arch): define sprite python engine boundary</w:t>
       </w:r>
     </w:p>
     <w:p>
@@ -570,7 +652,7 @@
         <w:pStyle w:val="ListBullet"/>
       </w:pPr>
       <w:r>
-        <w:t>`475899a feat(sprite-python): add authoring model prototype`</w:t>
+        <w:t>475899a feat(sprite-python): add authoring model prototype</w:t>
       </w:r>
     </w:p>
     <w:p>
@@ -578,7 +660,7 @@
         <w:pStyle w:val="ListBullet"/>
       </w:pPr>
       <w:r>
-        <w:t>`acc2967 test(sprite-python): validate generated subject fixtures`</w:t>
+        <w:t>acc2967 test(sprite-python): validate generated subject fixtures</w:t>
       </w:r>
     </w:p>
     <w:p>
@@ -586,7 +668,7 @@
         <w:pStyle w:val="ListBullet"/>
       </w:pPr>
       <w:r>
-        <w:t>`c3926af test(studio): cover sprite python fixture smoke`</w:t>
+        <w:t>c3926af test(studio): cover sprite python fixture smoke</w:t>
       </w:r>
     </w:p>
     <w:p>
@@ -594,7 +676,31 @@
         <w:pStyle w:val="ListBullet"/>
       </w:pPr>
       <w:r>
-        <w:t>report commit: `chore(report): add phase 3b sprite python evidence`</w:t>
+        <w:t>73ae9b1 chore(report): add phase 3b sprite python evidence</w:t>
+      </w:r>
+    </w:p>
+    <w:p>
+      <w:pPr>
+        <w:pStyle w:val="ListBullet"/>
+      </w:pPr>
+      <w:r>
+        <w:t>c49d8e1 docs(plan): commit strut sprite python roadmap</w:t>
+      </w:r>
+    </w:p>
+    <w:p>
+      <w:pPr>
+        <w:pStyle w:val="ListBullet"/>
+      </w:pPr>
+      <w:r>
+        <w:t>4709313 chore(format): apply rustfmt to phase 3b tests</w:t>
+      </w:r>
+    </w:p>
+    <w:p>
+      <w:pPr>
+        <w:pStyle w:val="ListBullet"/>
+      </w:pPr>
+      <w:r>
+        <w:t>report refresh commit: chore(report): refresh phase 3b completion evidence (current report commit)</w:t>
       </w:r>
     </w:p>
     <w:p>
@@ -610,7 +716,7 @@
         <w:pStyle w:val="ListBullet"/>
       </w:pPr>
       <w:r>
-        <w:t>`python -m pytest packages/strut-python/tests` - passed, 18 tests.</w:t>
+        <w:t>python -m pytest packages/strut-python/tests - passed, 18 tests.</w:t>
       </w:r>
     </w:p>
     <w:p>
@@ -618,7 +724,7 @@
         <w:pStyle w:val="ListBullet"/>
       </w:pPr>
       <w:r>
-        <w:t>`python packages/strut-python/examples/dice.py --json` - produced deterministic JSON; piping to `Select-Object` ended with a non-semantic broken-pipe exit, so direct fixture generation was also verified through `python -m strut_python.cli dice --json --out ...`.</w:t>
+        <w:t>From packages/strut-python: $env:PYTHONPATH='src'; python -m strut_python.cli loader --json --out $env:TEMP\strut-loader-plan.json - passed.</w:t>
       </w:r>
     </w:p>
     <w:p>
@@ -626,7 +732,7 @@
         <w:pStyle w:val="ListBullet"/>
       </w:pPr>
       <w:r>
-        <w:t>`cargo test -p strut-studio` - passed, 21 passed, 1 ignored authenticated Gemini CLI test.</w:t>
+        <w:t>cargo fmt --all --check - passed.</w:t>
       </w:r>
     </w:p>
     <w:p>
@@ -634,7 +740,7 @@
         <w:pStyle w:val="ListBullet"/>
       </w:pPr>
       <w:r>
-        <w:t>`cargo test --workspace` - passed, workspace tests green, same 1 ignored authenticated Gemini CLI test.</w:t>
+        <w:t>cargo test -p strut-studio - passed, 21 passed, 1 ignored authenticated Gemini CLI test.</w:t>
       </w:r>
     </w:p>
     <w:p>
@@ -642,7 +748,7 @@
         <w:pStyle w:val="ListBullet"/>
       </w:pPr>
       <w:r>
-        <w:t>`npm --workspace @strut/studio run check` - passed.</w:t>
+        <w:t>cargo test --workspace - passed, workspace tests green, same 1 ignored authenticated Gemini CLI test.</w:t>
       </w:r>
     </w:p>
     <w:p>
@@ -650,7 +756,7 @@
         <w:pStyle w:val="ListBullet"/>
       </w:pPr>
       <w:r>
-        <w:t>`npm run check` - passed.</w:t>
+        <w:t>npm --workspace @strut/studio run check - passed.</w:t>
       </w:r>
     </w:p>
     <w:p>
@@ -658,7 +764,7 @@
         <w:pStyle w:val="ListBullet"/>
       </w:pPr>
       <w:r>
-        <w:t>`python tests/ui/studio_bot_smoke.py` - passed.</w:t>
+        <w:t>npm run check - passed.</w:t>
       </w:r>
     </w:p>
     <w:p>
@@ -666,7 +772,20 @@
         <w:pStyle w:val="ListBullet"/>
       </w:pPr>
       <w:r>
-        <w:t>`git diff --check` - passed.</w:t>
+        <w:t>python tests/ui/studio_bot_smoke.py - passed.</w:t>
+      </w:r>
+    </w:p>
+    <w:p>
+      <w:pPr>
+        <w:pStyle w:val="ListBullet"/>
+      </w:pPr>
+      <w:r>
+        <w:t>git diff --check - passed.</w:t>
+      </w:r>
+    </w:p>
+    <w:p>
+      <w:r>
+        <w:t>The Python module command is reproducible from packages/strut-python only when PYTHONPATH=src is set, unless the package is installed in editable or normal mode. This phase used the explicit PowerShell form above rather than adding an installed console-script workflow.</w:t>
       </w:r>
     </w:p>
     <w:p>
@@ -697,7 +816,7 @@
         <w:pStyle w:val="ListBullet"/>
       </w:pPr>
       <w:r>
-        <w:t>`screenshots/browser/browser-phase-3b-sprite-python-smoke.png`</w:t>
+        <w:t>screenshots/browser/browser-phase-3b-sprite-python-smoke.png</w:t>
       </w:r>
     </w:p>
     <w:p>
@@ -768,7 +887,7 @@
         <w:pStyle w:val="ListBullet"/>
       </w:pPr>
       <w:r>
-        <w:t>`screenshots/tauri/tauri-01-dice-selection.png`</w:t>
+        <w:t>screenshots/tauri/tauri-01-dice-selection.png</w:t>
       </w:r>
     </w:p>
     <w:p>
@@ -776,7 +895,7 @@
         <w:pStyle w:val="ListBullet"/>
       </w:pPr>
       <w:r>
-        <w:t>`screenshots/tauri/tauri-02-loader-selection.png`</w:t>
+        <w:t>screenshots/tauri/tauri-02-loader-selection.png</w:t>
       </w:r>
     </w:p>
     <w:p>
@@ -805,7 +924,7 @@
         <w:pStyle w:val="ListBullet"/>
       </w:pPr>
       <w:r>
-        <w:t>Dice fixture rendered, `DieBody` could be selected, and the inspector showed `volume`.</w:t>
+        <w:t>Dice fixture rendered, DieBody could be selected, and the inspector showed volume.</w:t>
       </w:r>
     </w:p>
     <w:p>
@@ -813,7 +932,7 @@
         <w:pStyle w:val="ListBullet"/>
       </w:pPr>
       <w:r>
-        <w:t>Loader fixture rendered, `ActiveSegment` could be selected, and the inspector showed `active arc`.</w:t>
+        <w:t>Loader fixture rendered, ActiveSegment could be selected, and the inspector showed active arc.</w:t>
       </w:r>
     </w:p>
     <w:p>
@@ -842,7 +961,7 @@
         <w:pStyle w:val="ListBullet"/>
       </w:pPr>
       <w:r>
-        <w:t>`screenshots/before-phase-3a/browser-01-dice-selection.png`</w:t>
+        <w:t>screenshots/before-phase-3a/browser-01-dice-selection.png</w:t>
       </w:r>
     </w:p>
     <w:p>
@@ -850,7 +969,7 @@
         <w:pStyle w:val="ListBullet"/>
       </w:pPr>
       <w:r>
-        <w:t>`screenshots/before-phase-3a/browser-03-loader-selection.png`</w:t>
+        <w:t>screenshots/before-phase-3a/browser-03-loader-selection.png</w:t>
       </w:r>
     </w:p>
     <w:p>
@@ -858,7 +977,7 @@
         <w:pStyle w:val="ListBullet"/>
       </w:pPr>
       <w:r>
-        <w:t>`screenshots/before-phase-3a/tauri-01-dice-selection.png`</w:t>
+        <w:t>screenshots/before-phase-3a/tauri-01-dice-selection.png</w:t>
       </w:r>
     </w:p>
     <w:p>
@@ -871,7 +990,7 @@
         <w:pStyle w:val="ListBullet"/>
       </w:pPr>
       <w:r>
-        <w:t>`screenshots/browser/browser-phase-3b-sprite-python-smoke.png`</w:t>
+        <w:t>screenshots/browser/browser-phase-3b-sprite-python-smoke.png</w:t>
       </w:r>
     </w:p>
     <w:p>
@@ -879,7 +998,7 @@
         <w:pStyle w:val="ListBullet"/>
       </w:pPr>
       <w:r>
-        <w:t>`screenshots/tauri/tauri-01-dice-selection.png`</w:t>
+        <w:t>screenshots/tauri/tauri-01-dice-selection.png</w:t>
       </w:r>
     </w:p>
     <w:p>
@@ -887,7 +1006,7 @@
         <w:pStyle w:val="ListBullet"/>
       </w:pPr>
       <w:r>
-        <w:t>`screenshots/tauri/tauri-02-loader-selection.png`</w:t>
+        <w:t>screenshots/tauri/tauri-02-loader-selection.png</w:t>
       </w:r>
     </w:p>
     <w:p>
@@ -919,7 +1038,7 @@
         <w:pStyle w:val="ListBullet"/>
       </w:pPr>
       <w:r>
-        <w:t>Rust validation functions are still private to `strut-studio`; Phase 4 or Phase 5 may want a shared validation crate API if CLI work starts.</w:t>
+        <w:t>Rust validation functions are still private to strut-studio; a later phase may want a shared validation crate API if CLI work is explicitly started.</w:t>
       </w:r>
     </w:p>
     <w:p>
@@ -969,7 +1088,7 @@
         <w:pStyle w:val="ListBullet"/>
       </w:pPr>
       <w:r>
-        <w:t>store operation source metadata such as `sprite-python`, `ai`, or `manual`</w:t>
+        <w:t>store operation source metadata such as sprite-python, ai, or manual</w:t>
       </w:r>
     </w:p>
     <w:p>

</xml_diff>